<commit_message>
Tax + Diversity edits
Tax Policy: number the three principles in the introduction (1./2./3., matching
the Principle 1/2/3 sections). Diversity Policy: fix the page-4 layout — the
'Such initiatives may include' list items were mis-styled (one rendered as a
heading); reclassified as bullets so the list renders correctly.

Co-Authored-By: Claude Opus 4.8 <noreply@anthropic.com>
Claude-Session: https://claude.ai/code/session_01W3gw8scX9B7oMC33JPxjbS
</commit_message>
<xml_diff>
--- a/docs/files/Diversity_Policy__Policy_2026-06.docx
+++ b/docs/files/Diversity_Policy__Policy_2026-06.docx
@@ -19,7 +19,7 @@
               <a:graphicData uri="http://schemas.openxmlformats.org/drawingml/2006/picture">
                 <pic:pic>
                   <pic:nvPicPr>
-                    <pic:cNvPr id="0" name="tmpfs6nh6zd.png"/>
+                    <pic:cNvPr id="0" name="tmp7kev9tuu.png"/>
                     <pic:cNvPicPr/>
                   </pic:nvPicPr>
                   <pic:blipFill>
@@ -459,8 +459,8 @@
     </w:p>
     <w:p>
       <w:pPr>
-        <w:spacing w:after="200"/>
-        <w:jc w:val="both"/>
+        <w:pStyle w:val="ListBullet"/>
+        <w:spacing w:after="80"/>
       </w:pPr>
       <w:r>
         <w:rPr>
@@ -474,8 +474,8 @@
     </w:p>
     <w:p>
       <w:pPr>
-        <w:spacing w:after="200"/>
-        <w:jc w:val="both"/>
+        <w:pStyle w:val="ListBullet"/>
+        <w:spacing w:after="80"/>
       </w:pPr>
       <w:r>
         <w:rPr>
@@ -489,23 +489,23 @@
     </w:p>
     <w:p>
       <w:pPr>
-        <w:keepNext/>
-        <w:spacing w:before="260" w:after="160"/>
+        <w:pStyle w:val="ListBullet"/>
+        <w:spacing w:after="80"/>
       </w:pPr>
       <w:r>
         <w:rPr>
           <w:rFonts w:ascii="Avenir Next LT Pro" w:hAnsi="Avenir Next LT Pro"/>
-          <w:b/>
+          <w:b w:val="0"/>
           <w:color w:val="1C4076"/>
-          <w:sz w:val="28"/>
+          <w:sz w:val="22"/>
         </w:rPr>
         <w:t>ensuring that employees experience equal opportunities in respect of career advancement, regardless of gender</w:t>
       </w:r>
     </w:p>
     <w:p>
       <w:pPr>
-        <w:spacing w:after="200"/>
-        <w:jc w:val="both"/>
+        <w:pStyle w:val="ListBullet"/>
+        <w:spacing w:after="80"/>
       </w:pPr>
       <w:r>
         <w:rPr>

</xml_diff>

<commit_message>
Diversity Policy: incorporate Jeppe's updated version (issue #8)
The updated Diversity Policy Jeppe attached to request 21e2a25c (issue #8) had
not been incorporated — earlier edits were on the old source. Replace the source
with his version (approved by the Board of Directors on 19 May 2026), reapply the
page-4 bullet-list fix, and regenerate.

Co-Authored-By: Claude Opus 4.8 <noreply@anthropic.com>
Claude-Session: https://claude.ai/code/session_01W3gw8scX9B7oMC33JPxjbS
</commit_message>
<xml_diff>
--- a/docs/files/Diversity_Policy__Policy_2026-06.docx
+++ b/docs/files/Diversity_Policy__Policy_2026-06.docx
@@ -19,7 +19,7 @@
               <a:graphicData uri="http://schemas.openxmlformats.org/drawingml/2006/picture">
                 <pic:pic>
                   <pic:nvPicPr>
-                    <pic:cNvPr id="0" name="tmp7kev9tuu.png"/>
+                    <pic:cNvPr id="0" name="tmp65c4a2oo.png"/>
                     <pic:cNvPicPr/>
                   </pic:nvPicPr>
                   <pic:blipFill>
@@ -79,7 +79,7 @@
           <w:color w:val="1C4076"/>
           <w:sz w:val="22"/>
         </w:rPr>
-        <w:t>In BioMar, we have a fundamental belief that results are created by people. BioMar considers diversity a strength which makes a positive contribution to growth and value creation for the company. We believe diversity, equality and inclusion are fundamental drivers for unlocking the full human potential of society.</w:t>
+        <w:t>In BioMar, we have a fundamental belief that results are created by people. BioMar considers diversity a strength which makes a positive contribution to growth and value creation for the company. We believe diversity, equity, and inclusion are fundamental drivers for unlocking the full human potential of society.</w:t>
       </w:r>
     </w:p>
     <w:p>
@@ -304,7 +304,7 @@
           <w:color w:val="1C4076"/>
           <w:sz w:val="22"/>
         </w:rPr>
-        <w:t>At the same time, we commit to safeguarding policies and practices for remuneration, which are gender neutral and to the widest extent possible support the principle of equal pay for work of equal value.</w:t>
+        <w:t>At the same time, we commit to safeguarding policies and practices for remuneration, which are gender neutral and to the widest extent possible support the principle of equal pay for equal work or like value.</w:t>
       </w:r>
     </w:p>
     <w:p>
@@ -682,6 +682,21 @@
         <w:t>• Other relevant compliance policies and procedures applicable from time to time.</w:t>
       </w:r>
     </w:p>
+    <w:p>
+      <w:pPr>
+        <w:spacing w:after="200"/>
+        <w:jc w:val="both"/>
+      </w:pPr>
+      <w:r>
+        <w:rPr>
+          <w:rFonts w:ascii="Avenir Next LT Pro" w:hAnsi="Avenir Next LT Pro"/>
+          <w:b w:val="0"/>
+          <w:color w:val="1C4076"/>
+          <w:sz w:val="22"/>
+        </w:rPr>
+        <w:t>Approved by the Board of Directors on 19 May 2026.</w:t>
+      </w:r>
+    </w:p>
     <w:sectPr>
       <w:headerReference w:type="default" r:id="rId10"/>
       <w:footerReference w:type="default" r:id="rId11"/>

</xml_diff>

<commit_message>
Diversity Policy: apply Marianne's 3 wording fixes (request 989c7598)
- p.2: "diversity, equity, and inclusion" -> "diversity, equality, and
  inclusion"
- p.3: "...equal pay for equal work or like value" -> "...equal work or
  work of equal value" (matches the correct phrasing already used in the
  bullet list further down)
- p.5: removed the standalone "Approved by the Board of Directors on 19
  May 2026." sentence from the body content

Self-review passed (9/9: outputs, word, variants, metadata, coverage,
ligatures, plus the 3 checklist assertions) and moved to pending_review.
</commit_message>
<xml_diff>
--- a/docs/files/Diversity_Policy__Policy_2026-06.docx
+++ b/docs/files/Diversity_Policy__Policy_2026-06.docx
@@ -19,7 +19,7 @@
               <a:graphicData uri="http://schemas.openxmlformats.org/drawingml/2006/picture">
                 <pic:pic>
                   <pic:nvPicPr>
-                    <pic:cNvPr id="0" name="tmpm166kpsp.png"/>
+                    <pic:cNvPr id="0" name="tmpkp3wwjy0.png"/>
                     <pic:cNvPicPr/>
                   </pic:nvPicPr>
                   <pic:blipFill>
@@ -61,6 +61,7 @@
         <w:rPr>
           <w:rFonts w:ascii="Avenir Next LT Pro" w:hAnsi="Avenir Next LT Pro"/>
           <w:b/>
+          <w:i w:val="0"/>
           <w:color w:val="1C4076"/>
           <w:sz w:val="28"/>
         </w:rPr>
@@ -76,10 +77,11 @@
         <w:rPr>
           <w:rFonts w:ascii="Avenir Next LT Pro" w:hAnsi="Avenir Next LT Pro"/>
           <w:b w:val="0"/>
+          <w:i w:val="0"/>
           <w:color w:val="1C4076"/>
           <w:sz w:val="22"/>
         </w:rPr>
-        <w:t>In BioMar, we have a fundamental belief that results are created by people. BioMar considers diversity a strength which makes a positive contribution to growth and value creation for the company. We believe diversity, equity, and inclusion are fundamental drivers for unlocking the full human potential of society.</w:t>
+        <w:t>In BioMar, we have a fundamental belief that results are created by people. BioMar considers diversity a strength which makes a positive contribution to growth and value creation for the company. We believe diversity, equality, and inclusion are fundamental drivers for unlocking the full human potential of society.</w:t>
       </w:r>
     </w:p>
     <w:p>
@@ -91,6 +93,7 @@
         <w:rPr>
           <w:rFonts w:ascii="Avenir Next LT Pro" w:hAnsi="Avenir Next LT Pro"/>
           <w:b w:val="0"/>
+          <w:i w:val="0"/>
           <w:color w:val="1C4076"/>
           <w:sz w:val="22"/>
         </w:rPr>
@@ -106,6 +109,7 @@
         <w:rPr>
           <w:rFonts w:ascii="Avenir Next LT Pro" w:hAnsi="Avenir Next LT Pro"/>
           <w:b w:val="0"/>
+          <w:i w:val="0"/>
           <w:color w:val="1C4076"/>
           <w:sz w:val="22"/>
         </w:rPr>
@@ -121,6 +125,7 @@
         <w:rPr>
           <w:rFonts w:ascii="Avenir Next LT Pro" w:hAnsi="Avenir Next LT Pro"/>
           <w:b/>
+          <w:i w:val="0"/>
           <w:color w:val="1C4076"/>
           <w:sz w:val="28"/>
         </w:rPr>
@@ -136,6 +141,7 @@
         <w:rPr>
           <w:rFonts w:ascii="Avenir Next LT Pro" w:hAnsi="Avenir Next LT Pro"/>
           <w:b w:val="0"/>
+          <w:i w:val="0"/>
           <w:color w:val="1C4076"/>
           <w:sz w:val="22"/>
         </w:rPr>
@@ -151,6 +157,7 @@
         <w:rPr>
           <w:rFonts w:ascii="Avenir Next LT Pro" w:hAnsi="Avenir Next LT Pro"/>
           <w:b w:val="0"/>
+          <w:i w:val="0"/>
           <w:color w:val="1C4076"/>
           <w:sz w:val="22"/>
         </w:rPr>
@@ -166,6 +173,7 @@
         <w:rPr>
           <w:rFonts w:ascii="Avenir Next LT Pro" w:hAnsi="Avenir Next LT Pro"/>
           <w:b w:val="0"/>
+          <w:i w:val="0"/>
           <w:color w:val="1C4076"/>
           <w:sz w:val="22"/>
         </w:rPr>
@@ -181,6 +189,7 @@
         <w:rPr>
           <w:rFonts w:ascii="Avenir Next LT Pro" w:hAnsi="Avenir Next LT Pro"/>
           <w:b w:val="0"/>
+          <w:i w:val="0"/>
           <w:color w:val="1C4076"/>
           <w:sz w:val="22"/>
         </w:rPr>
@@ -196,6 +205,7 @@
         <w:rPr>
           <w:rFonts w:ascii="Avenir Next LT Pro" w:hAnsi="Avenir Next LT Pro"/>
           <w:b w:val="0"/>
+          <w:i w:val="0"/>
           <w:color w:val="1C4076"/>
           <w:sz w:val="22"/>
         </w:rPr>
@@ -211,6 +221,7 @@
         <w:rPr>
           <w:rFonts w:ascii="Avenir Next LT Pro" w:hAnsi="Avenir Next LT Pro"/>
           <w:b w:val="0"/>
+          <w:i w:val="0"/>
           <w:color w:val="1C4076"/>
           <w:sz w:val="22"/>
         </w:rPr>
@@ -226,6 +237,7 @@
         <w:rPr>
           <w:rFonts w:ascii="Avenir Next LT Pro" w:hAnsi="Avenir Next LT Pro"/>
           <w:b w:val="0"/>
+          <w:i w:val="0"/>
           <w:color w:val="1C4076"/>
           <w:sz w:val="22"/>
         </w:rPr>
@@ -241,6 +253,7 @@
         <w:rPr>
           <w:rFonts w:ascii="Avenir Next LT Pro" w:hAnsi="Avenir Next LT Pro"/>
           <w:b/>
+          <w:i w:val="0"/>
           <w:color w:val="1C4076"/>
           <w:sz w:val="28"/>
         </w:rPr>
@@ -256,6 +269,7 @@
         <w:rPr>
           <w:rFonts w:ascii="Avenir Next LT Pro" w:hAnsi="Avenir Next LT Pro"/>
           <w:b w:val="0"/>
+          <w:i w:val="0"/>
           <w:color w:val="1C4076"/>
           <w:sz w:val="22"/>
         </w:rPr>
@@ -271,6 +285,7 @@
         <w:rPr>
           <w:rFonts w:ascii="Avenir Next LT Pro" w:hAnsi="Avenir Next LT Pro"/>
           <w:b w:val="0"/>
+          <w:i w:val="0"/>
           <w:color w:val="1C4076"/>
           <w:sz w:val="22"/>
         </w:rPr>
@@ -286,6 +301,7 @@
         <w:rPr>
           <w:rFonts w:ascii="Avenir Next LT Pro" w:hAnsi="Avenir Next LT Pro"/>
           <w:b w:val="0"/>
+          <w:i w:val="0"/>
           <w:color w:val="1C4076"/>
           <w:sz w:val="22"/>
         </w:rPr>
@@ -301,10 +317,11 @@
         <w:rPr>
           <w:rFonts w:ascii="Avenir Next LT Pro" w:hAnsi="Avenir Next LT Pro"/>
           <w:b w:val="0"/>
+          <w:i w:val="0"/>
           <w:color w:val="1C4076"/>
           <w:sz w:val="22"/>
         </w:rPr>
-        <w:t>At the same time, we commit to safeguarding policies and practices for remuneration, which are gender neutral and to the widest extent possible support the principle of equal pay for equal work or like value.</w:t>
+        <w:t>At the same time, we commit to safeguarding policies and practices for remuneration, which are gender neutral and to the widest extent possible support the principle of equal pay for equal work or work of equal value.</w:t>
       </w:r>
     </w:p>
     <w:p>
@@ -316,6 +333,7 @@
         <w:rPr>
           <w:rFonts w:ascii="Avenir Next LT Pro" w:hAnsi="Avenir Next LT Pro"/>
           <w:b w:val="0"/>
+          <w:i w:val="0"/>
           <w:color w:val="1C4076"/>
           <w:sz w:val="22"/>
         </w:rPr>
@@ -331,6 +349,7 @@
         <w:rPr>
           <w:rFonts w:ascii="Avenir Next LT Pro" w:hAnsi="Avenir Next LT Pro"/>
           <w:b/>
+          <w:i w:val="0"/>
           <w:color w:val="1C4076"/>
           <w:sz w:val="28"/>
         </w:rPr>
@@ -346,6 +365,7 @@
         <w:rPr>
           <w:rFonts w:ascii="Avenir Next LT Pro" w:hAnsi="Avenir Next LT Pro"/>
           <w:b w:val="0"/>
+          <w:i w:val="0"/>
           <w:color w:val="1C4076"/>
           <w:sz w:val="22"/>
         </w:rPr>
@@ -361,6 +381,7 @@
         <w:rPr>
           <w:rFonts w:ascii="Avenir Next LT Pro" w:hAnsi="Avenir Next LT Pro"/>
           <w:b w:val="0"/>
+          <w:i w:val="0"/>
           <w:color w:val="1C4076"/>
           <w:sz w:val="22"/>
         </w:rPr>
@@ -376,6 +397,7 @@
         <w:rPr>
           <w:rFonts w:ascii="Avenir Next LT Pro" w:hAnsi="Avenir Next LT Pro"/>
           <w:b w:val="0"/>
+          <w:i w:val="0"/>
           <w:color w:val="1C4076"/>
           <w:sz w:val="22"/>
         </w:rPr>
@@ -391,6 +413,7 @@
         <w:rPr>
           <w:rFonts w:ascii="Avenir Next LT Pro" w:hAnsi="Avenir Next LT Pro"/>
           <w:b/>
+          <w:i w:val="0"/>
           <w:color w:val="1C4076"/>
           <w:sz w:val="28"/>
         </w:rPr>
@@ -406,6 +429,7 @@
         <w:rPr>
           <w:rFonts w:ascii="Avenir Next LT Pro" w:hAnsi="Avenir Next LT Pro"/>
           <w:b w:val="0"/>
+          <w:i w:val="0"/>
           <w:color w:val="1C4076"/>
           <w:sz w:val="22"/>
         </w:rPr>
@@ -421,6 +445,7 @@
         <w:rPr>
           <w:rFonts w:ascii="Avenir Next LT Pro" w:hAnsi="Avenir Next LT Pro"/>
           <w:b w:val="0"/>
+          <w:i w:val="0"/>
           <w:color w:val="1C4076"/>
           <w:sz w:val="22"/>
         </w:rPr>
@@ -436,6 +461,7 @@
         <w:rPr>
           <w:rFonts w:ascii="Avenir Next LT Pro" w:hAnsi="Avenir Next LT Pro"/>
           <w:b w:val="0"/>
+          <w:i w:val="0"/>
           <w:color w:val="1C4076"/>
           <w:sz w:val="22"/>
         </w:rPr>
@@ -451,6 +477,7 @@
         <w:rPr>
           <w:rFonts w:ascii="Avenir Next LT Pro" w:hAnsi="Avenir Next LT Pro"/>
           <w:b w:val="0"/>
+          <w:i w:val="0"/>
           <w:color w:val="1C4076"/>
           <w:sz w:val="22"/>
         </w:rPr>
@@ -466,6 +493,7 @@
         <w:rPr>
           <w:rFonts w:ascii="Avenir Next LT Pro" w:hAnsi="Avenir Next LT Pro"/>
           <w:b w:val="0"/>
+          <w:i w:val="0"/>
           <w:color w:val="1C4076"/>
           <w:sz w:val="22"/>
         </w:rPr>
@@ -481,6 +509,7 @@
         <w:rPr>
           <w:rFonts w:ascii="Avenir Next LT Pro" w:hAnsi="Avenir Next LT Pro"/>
           <w:b w:val="0"/>
+          <w:i w:val="0"/>
           <w:color w:val="1C4076"/>
           <w:sz w:val="22"/>
         </w:rPr>
@@ -496,6 +525,7 @@
         <w:rPr>
           <w:rFonts w:ascii="Avenir Next LT Pro" w:hAnsi="Avenir Next LT Pro"/>
           <w:b w:val="0"/>
+          <w:i w:val="0"/>
           <w:color w:val="1C4076"/>
           <w:sz w:val="22"/>
         </w:rPr>
@@ -511,6 +541,7 @@
         <w:rPr>
           <w:rFonts w:ascii="Avenir Next LT Pro" w:hAnsi="Avenir Next LT Pro"/>
           <w:b w:val="0"/>
+          <w:i w:val="0"/>
           <w:color w:val="1C4076"/>
           <w:sz w:val="22"/>
         </w:rPr>
@@ -526,6 +557,7 @@
         <w:rPr>
           <w:rFonts w:ascii="Avenir Next LT Pro" w:hAnsi="Avenir Next LT Pro"/>
           <w:b w:val="0"/>
+          <w:i w:val="0"/>
           <w:color w:val="1C4076"/>
           <w:sz w:val="22"/>
         </w:rPr>
@@ -541,6 +573,7 @@
         <w:rPr>
           <w:rFonts w:ascii="Avenir Next LT Pro" w:hAnsi="Avenir Next LT Pro"/>
           <w:b/>
+          <w:i w:val="0"/>
           <w:color w:val="1C4076"/>
           <w:sz w:val="22"/>
         </w:rPr>
@@ -556,6 +589,7 @@
         <w:rPr>
           <w:rFonts w:ascii="Avenir Next LT Pro" w:hAnsi="Avenir Next LT Pro"/>
           <w:b w:val="0"/>
+          <w:i w:val="0"/>
           <w:color w:val="1C4076"/>
           <w:sz w:val="22"/>
         </w:rPr>
@@ -571,6 +605,7 @@
         <w:rPr>
           <w:rFonts w:ascii="Avenir Next LT Pro" w:hAnsi="Avenir Next LT Pro"/>
           <w:b w:val="0"/>
+          <w:i w:val="0"/>
           <w:color w:val="1C4076"/>
           <w:sz w:val="22"/>
         </w:rPr>
@@ -586,6 +621,7 @@
         <w:rPr>
           <w:rFonts w:ascii="Avenir Next LT Pro" w:hAnsi="Avenir Next LT Pro"/>
           <w:b w:val="0"/>
+          <w:i w:val="0"/>
           <w:color w:val="1C4076"/>
           <w:sz w:val="22"/>
         </w:rPr>
@@ -601,6 +637,7 @@
         <w:rPr>
           <w:rFonts w:ascii="Avenir Next LT Pro" w:hAnsi="Avenir Next LT Pro"/>
           <w:b w:val="0"/>
+          <w:i w:val="0"/>
           <w:color w:val="1C4076"/>
           <w:sz w:val="22"/>
         </w:rPr>
@@ -616,6 +653,7 @@
         <w:rPr>
           <w:rFonts w:ascii="Avenir Next LT Pro" w:hAnsi="Avenir Next LT Pro"/>
           <w:b w:val="0"/>
+          <w:i w:val="0"/>
           <w:color w:val="1C4076"/>
           <w:sz w:val="22"/>
         </w:rPr>
@@ -631,6 +669,7 @@
         <w:rPr>
           <w:rFonts w:ascii="Avenir Next LT Pro" w:hAnsi="Avenir Next LT Pro"/>
           <w:b w:val="0"/>
+          <w:i w:val="0"/>
           <w:color w:val="1C4076"/>
           <w:sz w:val="22"/>
         </w:rPr>
@@ -646,6 +685,7 @@
         <w:rPr>
           <w:rFonts w:ascii="Avenir Next LT Pro" w:hAnsi="Avenir Next LT Pro"/>
           <w:b w:val="0"/>
+          <w:i w:val="0"/>
           <w:color w:val="1C4076"/>
           <w:sz w:val="22"/>
         </w:rPr>
@@ -661,6 +701,7 @@
         <w:rPr>
           <w:rFonts w:ascii="Avenir Next LT Pro" w:hAnsi="Avenir Next LT Pro"/>
           <w:b w:val="0"/>
+          <w:i w:val="0"/>
           <w:color w:val="1C4076"/>
           <w:sz w:val="22"/>
         </w:rPr>
@@ -676,25 +717,11 @@
         <w:rPr>
           <w:rFonts w:ascii="Avenir Next LT Pro" w:hAnsi="Avenir Next LT Pro"/>
           <w:b w:val="0"/>
+          <w:i w:val="0"/>
           <w:color w:val="1C4076"/>
           <w:sz w:val="22"/>
         </w:rPr>
         <w:t>• Other relevant compliance policies and procedures applicable from time to time.</w:t>
-      </w:r>
-    </w:p>
-    <w:p>
-      <w:pPr>
-        <w:spacing w:after="200"/>
-        <w:jc w:val="both"/>
-      </w:pPr>
-      <w:r>
-        <w:rPr>
-          <w:rFonts w:ascii="Avenir Next LT Pro" w:hAnsi="Avenir Next LT Pro"/>
-          <w:b w:val="0"/>
-          <w:color w:val="1C4076"/>
-          <w:sz w:val="22"/>
-        </w:rPr>
-        <w:t>Approved by the Board of Directors on 19 May 2026.</w:t>
       </w:r>
     </w:p>
     <w:sectPr>
@@ -723,6 +750,7 @@
       <w:rPr>
         <w:rFonts w:ascii="Avenir Next LT Pro" w:hAnsi="Avenir Next LT Pro"/>
         <w:b w:val="0"/>
+        <w:i w:val="0"/>
         <w:color w:val="1C4076"/>
         <w:sz w:val="16"/>
       </w:rPr>
@@ -744,6 +772,7 @@
       <w:rPr>
         <w:rFonts w:ascii="Avenir Next LT Pro" w:hAnsi="Avenir Next LT Pro"/>
         <w:b w:val="0"/>
+        <w:i w:val="0"/>
         <w:color w:val="1C4076"/>
         <w:sz w:val="16"/>
       </w:rPr>
@@ -756,6 +785,7 @@
       <w:rPr>
         <w:rFonts w:ascii="Avenir Next LT Pro" w:hAnsi="Avenir Next LT Pro"/>
         <w:b w:val="0"/>
+        <w:i w:val="0"/>
         <w:color w:val="1C4076"/>
         <w:sz w:val="16"/>
       </w:rPr>

</xml_diff>

<commit_message>
Diversity Policy: drop "equal work or" per Marianne's follow-up
Request 0e6ca721: "of equal pay for equal work or work of equal value"
-> "of equal pay for work of equal value" in the remuneration-practices
paragraph (the bullet-list phrasing a few lines below keeps "equal work
or" — she only flagged the body sentence).

Self-review passed (6/6 + 1 checklist assertion); moved to
pending_review.
</commit_message>
<xml_diff>
--- a/docs/files/Diversity_Policy__Policy_2026-06.docx
+++ b/docs/files/Diversity_Policy__Policy_2026-06.docx
@@ -19,7 +19,7 @@
               <a:graphicData uri="http://schemas.openxmlformats.org/drawingml/2006/picture">
                 <pic:pic>
                   <pic:nvPicPr>
-                    <pic:cNvPr id="0" name="tmpkp3wwjy0.png"/>
+                    <pic:cNvPr id="0" name="tmp9r6_awvq.png"/>
                     <pic:cNvPicPr/>
                   </pic:nvPicPr>
                   <pic:blipFill>
@@ -321,7 +321,7 @@
           <w:color w:val="1C4076"/>
           <w:sz w:val="22"/>
         </w:rPr>
-        <w:t>At the same time, we commit to safeguarding policies and practices for remuneration, which are gender neutral and to the widest extent possible support the principle of equal pay for equal work or work of equal value.</w:t>
+        <w:t>At the same time, we commit to safeguarding policies and practices for remuneration, which are gender neutral and to the widest extent possible support the principle of equal pay for work of equal value.</w:t>
       </w:r>
     </w:p>
     <w:p>

</xml_diff>